<commit_message>
England-wide scope: permanent recruitment across England, temporary pilot local first; CQC market size by region; England provider list; registration page and adverts updated
Co-Authored-By: Claude Opus 5.5 <noreply@anthropic.com>
Claude-Session: https://claude.ai/code/session_01XByJMQfkaq2do2XmLu4Dhj
</commit_message>
<xml_diff>
--- a/documents/Haverton Recruitment/2 Business Plan/Haverton Recruitment Business Plan.docx
+++ b/documents/Haverton Recruitment/2 Business Plan/Haverton Recruitment Business Plan.docx
@@ -43,7 +43,7 @@
           <w:sz w:val="24"/>
           <w:szCs w:val="24"/>
         </w:rPr>
-        <w:t xml:space="preserve">Specialist recruitment for adult social care in Kent and South East London</w:t>
+        <w:t xml:space="preserve">Specialist recruitment for adult social care providers across England</w:t>
       </w:r>
     </w:p>
     <w:p>
@@ -1161,7 +1161,17 @@
         <w:t xml:space="preserve">What we are.</w:t>
       </w:r>
       <w:r>
-        <w:t xml:space="preserve"> A specialist recruitment agency for adult social care. We find care managers, senior carers and care staff for care homes, home care agencies and supported living services in Kent and South East London.</w:t>
+        <w:t xml:space="preserve"> A specialist recruitment agency for adult social care. We find care managers, nurses, senior carers and care staff for care homes, nursing homes, home care agencies and supported living services </w:t>
+      </w:r>
+      <w:r>
+        <w:rPr>
+          <w:b/>
+          <w:bCs/>
+        </w:rPr>
+        <w:t xml:space="preserve">across England</w:t>
+      </w:r>
+      <w:r>
+        <w:t xml:space="preserve">. Permanent recruitment is England-wide from the start. Temporary staffing begins with a small pilot near our Kent base and expands region by region only when the controls are proven.</w:t>
       </w:r>
     </w:p>
     <w:p>
@@ -2393,7 +2403,24 @@
               <w:spacing w:after="40" w:line="270"/>
             </w:pPr>
             <w:r>
-              <w:t xml:space="preserve">Swanley, Dartford, Gravesham, Sevenoaks, Bexley, Bromley, Medway and South East London first, then wider Kent, London, Surrey, Essex and East Sussex.</w:t>
+              <w:rPr>
+                <w:b/>
+                <w:bCs/>
+              </w:rPr>
+              <w:t xml:space="preserve">Permanent recruitment and retained search: all of England.</w:t>
+            </w:r>
+            <w:r>
+              <w:t xml:space="preserve"> Clients are briefed by phone or video, candidates are interviewed by video, and we visit sites where it adds value. </w:t>
+            </w:r>
+            <w:r>
+              <w:rPr>
+                <w:b/>
+                <w:bCs/>
+              </w:rPr>
+              <w:t xml:space="preserve">Temporary staffing: a local pilot first</w:t>
+            </w:r>
+            <w:r>
+              <w:t xml:space="preserve"> (Kent and South East London, near our base), then region by region. Temporary supply needs local on-call cover, fast replacement of workers and local compliance checks, so it cannot safely start everywhere at once.</w:t>
             </w:r>
           </w:p>
         </w:tc>
@@ -2735,17 +2762,737 @@
           <w:b/>
           <w:bCs/>
         </w:rPr>
-        <w:t xml:space="preserve">Local figures to verify:</w:t>
+        <w:t xml:space="preserve">Verified market size (CQC care directory, 23 September 2026):</w:t>
       </w:r>
       <w:r>
-        <w:t xml:space="preserve"> an external research summary suggested Kent has around 917 regulated adult social care services, about 46,000 posts and about 2,700 vacancies, and that Bexley has around 106 services with a vacancy rate near 10.2%. </w:t>
+        <w:t xml:space="preserve"> there are </w:t>
       </w:r>
       <w:r>
         <w:rPr>
           <w:b/>
           <w:bCs/>
         </w:rPr>
-        <w:t xml:space="preserve">[verify each figure against Skills for Care local area data, with the date, before using it]</w:t>
+        <w:t xml:space="preserve">30,186 CQC-registered care services in England</w:t>
+      </w:r>
+      <w:r>
+        <w:t xml:space="preserve"> of the types we recruit for: 14,464 home care agencies, 10,418 residential homes, 5,029 supported living services and 4,532 nursing homes (a service can be more than one type).</w:t>
+      </w:r>
+    </w:p>
+    <w:tbl>
+      <w:tblPr>
+        <w:tblW w:type="dxa" w:w="9638"/>
+        <w:tblBorders>
+          <w:top w:val="single" w:color="auto" w:sz="4"/>
+          <w:left w:val="single" w:color="auto" w:sz="4"/>
+          <w:bottom w:val="single" w:color="auto" w:sz="4"/>
+          <w:right w:val="single" w:color="auto" w:sz="4"/>
+          <w:insideH w:val="single" w:color="auto" w:sz="4"/>
+          <w:insideV w:val="single" w:color="auto" w:sz="4"/>
+        </w:tblBorders>
+      </w:tblPr>
+      <w:tblGrid>
+        <w:gridCol w:w="2891"/>
+        <w:gridCol w:w="1927"/>
+        <w:gridCol w:w="2891"/>
+        <w:gridCol w:w="1929"/>
+      </w:tblGrid>
+      <w:tr>
+        <w:trPr>
+          <w:tblHeader/>
+        </w:trPr>
+        <w:tc>
+          <w:tcPr>
+            <w:tcW w:type="dxa" w:w="2891"/>
+            <w:tcBorders>
+              <w:top w:val="single" w:color="D9D2C3" w:sz="4"/>
+              <w:left w:val="single" w:color="D9D2C3" w:sz="4"/>
+              <w:bottom w:val="single" w:color="D9D2C3" w:sz="4"/>
+              <w:right w:val="single" w:color="D9D2C3" w:sz="4"/>
+            </w:tcBorders>
+            <w:shd w:fill="F3EFE6" w:color="auto" w:val="clear"/>
+            <w:tcMar>
+              <w:top w:type="dxa" w:w="80"/>
+              <w:left w:type="dxa" w:w="110"/>
+              <w:bottom w:type="dxa" w:w="80"/>
+              <w:right w:type="dxa" w:w="110"/>
+            </w:tcMar>
+            <w:vAlign w:val="top"/>
+          </w:tcPr>
+          <w:p>
+            <w:pPr>
+              <w:spacing w:after="40" w:line="270"/>
+            </w:pPr>
+            <w:r>
+              <w:rPr>
+                <w:b/>
+                <w:bCs/>
+                <w:color w:val="1B2B45"/>
+              </w:rPr>
+              <w:t xml:space="preserve">Region</w:t>
+            </w:r>
+          </w:p>
+        </w:tc>
+        <w:tc>
+          <w:tcPr>
+            <w:tcW w:type="dxa" w:w="1927"/>
+            <w:tcBorders>
+              <w:top w:val="single" w:color="D9D2C3" w:sz="4"/>
+              <w:left w:val="single" w:color="D9D2C3" w:sz="4"/>
+              <w:bottom w:val="single" w:color="D9D2C3" w:sz="4"/>
+              <w:right w:val="single" w:color="D9D2C3" w:sz="4"/>
+            </w:tcBorders>
+            <w:shd w:fill="F3EFE6" w:color="auto" w:val="clear"/>
+            <w:tcMar>
+              <w:top w:type="dxa" w:w="80"/>
+              <w:left w:type="dxa" w:w="110"/>
+              <w:bottom w:type="dxa" w:w="80"/>
+              <w:right w:type="dxa" w:w="110"/>
+            </w:tcMar>
+            <w:vAlign w:val="top"/>
+          </w:tcPr>
+          <w:p>
+            <w:pPr>
+              <w:spacing w:after="40" w:line="270"/>
+            </w:pPr>
+            <w:r>
+              <w:rPr>
+                <w:b/>
+                <w:bCs/>
+                <w:color w:val="1B2B45"/>
+              </w:rPr>
+              <w:t xml:space="preserve">Care services</w:t>
+            </w:r>
+          </w:p>
+        </w:tc>
+        <w:tc>
+          <w:tcPr>
+            <w:tcW w:type="dxa" w:w="2891"/>
+            <w:tcBorders>
+              <w:top w:val="single" w:color="D9D2C3" w:sz="4"/>
+              <w:left w:val="single" w:color="D9D2C3" w:sz="4"/>
+              <w:bottom w:val="single" w:color="D9D2C3" w:sz="4"/>
+              <w:right w:val="single" w:color="D9D2C3" w:sz="4"/>
+            </w:tcBorders>
+            <w:shd w:fill="F3EFE6" w:color="auto" w:val="clear"/>
+            <w:tcMar>
+              <w:top w:type="dxa" w:w="80"/>
+              <w:left w:type="dxa" w:w="110"/>
+              <w:bottom w:type="dxa" w:w="80"/>
+              <w:right w:type="dxa" w:w="110"/>
+            </w:tcMar>
+            <w:vAlign w:val="top"/>
+          </w:tcPr>
+          <w:p>
+            <w:pPr>
+              <w:spacing w:after="40" w:line="270"/>
+            </w:pPr>
+            <w:r>
+              <w:rPr>
+                <w:b/>
+                <w:bCs/>
+                <w:color w:val="1B2B45"/>
+              </w:rPr>
+              <w:t xml:space="preserve">Region</w:t>
+            </w:r>
+          </w:p>
+        </w:tc>
+        <w:tc>
+          <w:tcPr>
+            <w:tcW w:type="dxa" w:w="1929"/>
+            <w:tcBorders>
+              <w:top w:val="single" w:color="D9D2C3" w:sz="4"/>
+              <w:left w:val="single" w:color="D9D2C3" w:sz="4"/>
+              <w:bottom w:val="single" w:color="D9D2C3" w:sz="4"/>
+              <w:right w:val="single" w:color="D9D2C3" w:sz="4"/>
+            </w:tcBorders>
+            <w:shd w:fill="F3EFE6" w:color="auto" w:val="clear"/>
+            <w:tcMar>
+              <w:top w:type="dxa" w:w="80"/>
+              <w:left w:type="dxa" w:w="110"/>
+              <w:bottom w:type="dxa" w:w="80"/>
+              <w:right w:type="dxa" w:w="110"/>
+            </w:tcMar>
+            <w:vAlign w:val="top"/>
+          </w:tcPr>
+          <w:p>
+            <w:pPr>
+              <w:spacing w:after="40" w:line="270"/>
+            </w:pPr>
+            <w:r>
+              <w:rPr>
+                <w:b/>
+                <w:bCs/>
+                <w:color w:val="1B2B45"/>
+              </w:rPr>
+              <w:t xml:space="preserve">Care services</w:t>
+            </w:r>
+          </w:p>
+        </w:tc>
+      </w:tr>
+      <w:tr>
+        <w:trPr>
+          <w:cantSplit/>
+        </w:trPr>
+        <w:tc>
+          <w:tcPr>
+            <w:tcW w:type="dxa" w:w="2891"/>
+            <w:tcBorders>
+              <w:top w:val="single" w:color="D9D2C3" w:sz="4"/>
+              <w:left w:val="single" w:color="D9D2C3" w:sz="4"/>
+              <w:bottom w:val="single" w:color="D9D2C3" w:sz="4"/>
+              <w:right w:val="single" w:color="D9D2C3" w:sz="4"/>
+            </w:tcBorders>
+            <w:tcMar>
+              <w:top w:type="dxa" w:w="80"/>
+              <w:left w:type="dxa" w:w="110"/>
+              <w:bottom w:type="dxa" w:w="80"/>
+              <w:right w:type="dxa" w:w="110"/>
+            </w:tcMar>
+            <w:vAlign w:val="top"/>
+          </w:tcPr>
+          <w:p>
+            <w:pPr>
+              <w:spacing w:after="40" w:line="270"/>
+            </w:pPr>
+            <w:r>
+              <w:t xml:space="preserve">South East</w:t>
+            </w:r>
+          </w:p>
+        </w:tc>
+        <w:tc>
+          <w:tcPr>
+            <w:tcW w:type="dxa" w:w="1927"/>
+            <w:tcBorders>
+              <w:top w:val="single" w:color="D9D2C3" w:sz="4"/>
+              <w:left w:val="single" w:color="D9D2C3" w:sz="4"/>
+              <w:bottom w:val="single" w:color="D9D2C3" w:sz="4"/>
+              <w:right w:val="single" w:color="D9D2C3" w:sz="4"/>
+            </w:tcBorders>
+            <w:tcMar>
+              <w:top w:type="dxa" w:w="80"/>
+              <w:left w:type="dxa" w:w="110"/>
+              <w:bottom w:type="dxa" w:w="80"/>
+              <w:right w:type="dxa" w:w="110"/>
+            </w:tcMar>
+            <w:vAlign w:val="top"/>
+          </w:tcPr>
+          <w:p>
+            <w:pPr>
+              <w:spacing w:after="40" w:line="270"/>
+            </w:pPr>
+            <w:r>
+              <w:t xml:space="preserve">5,520</w:t>
+            </w:r>
+          </w:p>
+        </w:tc>
+        <w:tc>
+          <w:tcPr>
+            <w:tcW w:type="dxa" w:w="2891"/>
+            <w:tcBorders>
+              <w:top w:val="single" w:color="D9D2C3" w:sz="4"/>
+              <w:left w:val="single" w:color="D9D2C3" w:sz="4"/>
+              <w:bottom w:val="single" w:color="D9D2C3" w:sz="4"/>
+              <w:right w:val="single" w:color="D9D2C3" w:sz="4"/>
+            </w:tcBorders>
+            <w:tcMar>
+              <w:top w:type="dxa" w:w="80"/>
+              <w:left w:type="dxa" w:w="110"/>
+              <w:bottom w:type="dxa" w:w="80"/>
+              <w:right w:type="dxa" w:w="110"/>
+            </w:tcMar>
+            <w:vAlign w:val="top"/>
+          </w:tcPr>
+          <w:p>
+            <w:pPr>
+              <w:spacing w:after="40" w:line="270"/>
+            </w:pPr>
+            <w:r>
+              <w:t xml:space="preserve">South West</w:t>
+            </w:r>
+          </w:p>
+        </w:tc>
+        <w:tc>
+          <w:tcPr>
+            <w:tcW w:type="dxa" w:w="1929"/>
+            <w:tcBorders>
+              <w:top w:val="single" w:color="D9D2C3" w:sz="4"/>
+              <w:left w:val="single" w:color="D9D2C3" w:sz="4"/>
+              <w:bottom w:val="single" w:color="D9D2C3" w:sz="4"/>
+              <w:right w:val="single" w:color="D9D2C3" w:sz="4"/>
+            </w:tcBorders>
+            <w:tcMar>
+              <w:top w:type="dxa" w:w="80"/>
+              <w:left w:type="dxa" w:w="110"/>
+              <w:bottom w:type="dxa" w:w="80"/>
+              <w:right w:type="dxa" w:w="110"/>
+            </w:tcMar>
+            <w:vAlign w:val="top"/>
+          </w:tcPr>
+          <w:p>
+            <w:pPr>
+              <w:spacing w:after="40" w:line="270"/>
+            </w:pPr>
+            <w:r>
+              <w:t xml:space="preserve">3,246</w:t>
+            </w:r>
+          </w:p>
+        </w:tc>
+      </w:tr>
+      <w:tr>
+        <w:trPr>
+          <w:cantSplit/>
+        </w:trPr>
+        <w:tc>
+          <w:tcPr>
+            <w:tcW w:type="dxa" w:w="2891"/>
+            <w:tcBorders>
+              <w:top w:val="single" w:color="D9D2C3" w:sz="4"/>
+              <w:left w:val="single" w:color="D9D2C3" w:sz="4"/>
+              <w:bottom w:val="single" w:color="D9D2C3" w:sz="4"/>
+              <w:right w:val="single" w:color="D9D2C3" w:sz="4"/>
+            </w:tcBorders>
+            <w:tcMar>
+              <w:top w:type="dxa" w:w="80"/>
+              <w:left w:type="dxa" w:w="110"/>
+              <w:bottom w:type="dxa" w:w="80"/>
+              <w:right w:type="dxa" w:w="110"/>
+            </w:tcMar>
+            <w:vAlign w:val="top"/>
+          </w:tcPr>
+          <w:p>
+            <w:pPr>
+              <w:spacing w:after="40" w:line="270"/>
+            </w:pPr>
+            <w:r>
+              <w:t xml:space="preserve">London</w:t>
+            </w:r>
+          </w:p>
+        </w:tc>
+        <w:tc>
+          <w:tcPr>
+            <w:tcW w:type="dxa" w:w="1927"/>
+            <w:tcBorders>
+              <w:top w:val="single" w:color="D9D2C3" w:sz="4"/>
+              <w:left w:val="single" w:color="D9D2C3" w:sz="4"/>
+              <w:bottom w:val="single" w:color="D9D2C3" w:sz="4"/>
+              <w:right w:val="single" w:color="D9D2C3" w:sz="4"/>
+            </w:tcBorders>
+            <w:tcMar>
+              <w:top w:type="dxa" w:w="80"/>
+              <w:left w:type="dxa" w:w="110"/>
+              <w:bottom w:type="dxa" w:w="80"/>
+              <w:right w:type="dxa" w:w="110"/>
+            </w:tcMar>
+            <w:vAlign w:val="top"/>
+          </w:tcPr>
+          <w:p>
+            <w:pPr>
+              <w:spacing w:after="40" w:line="270"/>
+            </w:pPr>
+            <w:r>
+              <w:t xml:space="preserve">3,891</w:t>
+            </w:r>
+          </w:p>
+        </w:tc>
+        <w:tc>
+          <w:tcPr>
+            <w:tcW w:type="dxa" w:w="2891"/>
+            <w:tcBorders>
+              <w:top w:val="single" w:color="D9D2C3" w:sz="4"/>
+              <w:left w:val="single" w:color="D9D2C3" w:sz="4"/>
+              <w:bottom w:val="single" w:color="D9D2C3" w:sz="4"/>
+              <w:right w:val="single" w:color="D9D2C3" w:sz="4"/>
+            </w:tcBorders>
+            <w:tcMar>
+              <w:top w:type="dxa" w:w="80"/>
+              <w:left w:type="dxa" w:w="110"/>
+              <w:bottom w:type="dxa" w:w="80"/>
+              <w:right w:type="dxa" w:w="110"/>
+            </w:tcMar>
+            <w:vAlign w:val="top"/>
+          </w:tcPr>
+          <w:p>
+            <w:pPr>
+              <w:spacing w:after="40" w:line="270"/>
+            </w:pPr>
+            <w:r>
+              <w:t xml:space="preserve">East Midlands</w:t>
+            </w:r>
+          </w:p>
+        </w:tc>
+        <w:tc>
+          <w:tcPr>
+            <w:tcW w:type="dxa" w:w="1929"/>
+            <w:tcBorders>
+              <w:top w:val="single" w:color="D9D2C3" w:sz="4"/>
+              <w:left w:val="single" w:color="D9D2C3" w:sz="4"/>
+              <w:bottom w:val="single" w:color="D9D2C3" w:sz="4"/>
+              <w:right w:val="single" w:color="D9D2C3" w:sz="4"/>
+            </w:tcBorders>
+            <w:tcMar>
+              <w:top w:type="dxa" w:w="80"/>
+              <w:left w:type="dxa" w:w="110"/>
+              <w:bottom w:type="dxa" w:w="80"/>
+              <w:right w:type="dxa" w:w="110"/>
+            </w:tcMar>
+            <w:vAlign w:val="top"/>
+          </w:tcPr>
+          <w:p>
+            <w:pPr>
+              <w:spacing w:after="40" w:line="270"/>
+            </w:pPr>
+            <w:r>
+              <w:t xml:space="preserve">2,957</w:t>
+            </w:r>
+          </w:p>
+        </w:tc>
+      </w:tr>
+      <w:tr>
+        <w:trPr>
+          <w:cantSplit/>
+        </w:trPr>
+        <w:tc>
+          <w:tcPr>
+            <w:tcW w:type="dxa" w:w="2891"/>
+            <w:tcBorders>
+              <w:top w:val="single" w:color="D9D2C3" w:sz="4"/>
+              <w:left w:val="single" w:color="D9D2C3" w:sz="4"/>
+              <w:bottom w:val="single" w:color="D9D2C3" w:sz="4"/>
+              <w:right w:val="single" w:color="D9D2C3" w:sz="4"/>
+            </w:tcBorders>
+            <w:tcMar>
+              <w:top w:type="dxa" w:w="80"/>
+              <w:left w:type="dxa" w:w="110"/>
+              <w:bottom w:type="dxa" w:w="80"/>
+              <w:right w:type="dxa" w:w="110"/>
+            </w:tcMar>
+            <w:vAlign w:val="top"/>
+          </w:tcPr>
+          <w:p>
+            <w:pPr>
+              <w:spacing w:after="40" w:line="270"/>
+            </w:pPr>
+            <w:r>
+              <w:t xml:space="preserve">North West</w:t>
+            </w:r>
+          </w:p>
+        </w:tc>
+        <w:tc>
+          <w:tcPr>
+            <w:tcW w:type="dxa" w:w="1927"/>
+            <w:tcBorders>
+              <w:top w:val="single" w:color="D9D2C3" w:sz="4"/>
+              <w:left w:val="single" w:color="D9D2C3" w:sz="4"/>
+              <w:bottom w:val="single" w:color="D9D2C3" w:sz="4"/>
+              <w:right w:val="single" w:color="D9D2C3" w:sz="4"/>
+            </w:tcBorders>
+            <w:tcMar>
+              <w:top w:type="dxa" w:w="80"/>
+              <w:left w:type="dxa" w:w="110"/>
+              <w:bottom w:type="dxa" w:w="80"/>
+              <w:right w:type="dxa" w:w="110"/>
+            </w:tcMar>
+            <w:vAlign w:val="top"/>
+          </w:tcPr>
+          <w:p>
+            <w:pPr>
+              <w:spacing w:after="40" w:line="270"/>
+            </w:pPr>
+            <w:r>
+              <w:t xml:space="preserve">3,611</w:t>
+            </w:r>
+          </w:p>
+        </w:tc>
+        <w:tc>
+          <w:tcPr>
+            <w:tcW w:type="dxa" w:w="2891"/>
+            <w:tcBorders>
+              <w:top w:val="single" w:color="D9D2C3" w:sz="4"/>
+              <w:left w:val="single" w:color="D9D2C3" w:sz="4"/>
+              <w:bottom w:val="single" w:color="D9D2C3" w:sz="4"/>
+              <w:right w:val="single" w:color="D9D2C3" w:sz="4"/>
+            </w:tcBorders>
+            <w:tcMar>
+              <w:top w:type="dxa" w:w="80"/>
+              <w:left w:type="dxa" w:w="110"/>
+              <w:bottom w:type="dxa" w:w="80"/>
+              <w:right w:type="dxa" w:w="110"/>
+            </w:tcMar>
+            <w:vAlign w:val="top"/>
+          </w:tcPr>
+          <w:p>
+            <w:pPr>
+              <w:spacing w:after="40" w:line="270"/>
+            </w:pPr>
+            <w:r>
+              <w:t xml:space="preserve">Yorkshire and Humber</w:t>
+            </w:r>
+          </w:p>
+        </w:tc>
+        <w:tc>
+          <w:tcPr>
+            <w:tcW w:type="dxa" w:w="1929"/>
+            <w:tcBorders>
+              <w:top w:val="single" w:color="D9D2C3" w:sz="4"/>
+              <w:left w:val="single" w:color="D9D2C3" w:sz="4"/>
+              <w:bottom w:val="single" w:color="D9D2C3" w:sz="4"/>
+              <w:right w:val="single" w:color="D9D2C3" w:sz="4"/>
+            </w:tcBorders>
+            <w:tcMar>
+              <w:top w:type="dxa" w:w="80"/>
+              <w:left w:type="dxa" w:w="110"/>
+              <w:bottom w:type="dxa" w:w="80"/>
+              <w:right w:type="dxa" w:w="110"/>
+            </w:tcMar>
+            <w:vAlign w:val="top"/>
+          </w:tcPr>
+          <w:p>
+            <w:pPr>
+              <w:spacing w:after="40" w:line="270"/>
+            </w:pPr>
+            <w:r>
+              <w:t xml:space="preserve">2,765</w:t>
+            </w:r>
+          </w:p>
+        </w:tc>
+      </w:tr>
+      <w:tr>
+        <w:trPr>
+          <w:cantSplit/>
+        </w:trPr>
+        <w:tc>
+          <w:tcPr>
+            <w:tcW w:type="dxa" w:w="2891"/>
+            <w:tcBorders>
+              <w:top w:val="single" w:color="D9D2C3" w:sz="4"/>
+              <w:left w:val="single" w:color="D9D2C3" w:sz="4"/>
+              <w:bottom w:val="single" w:color="D9D2C3" w:sz="4"/>
+              <w:right w:val="single" w:color="D9D2C3" w:sz="4"/>
+            </w:tcBorders>
+            <w:tcMar>
+              <w:top w:type="dxa" w:w="80"/>
+              <w:left w:type="dxa" w:w="110"/>
+              <w:bottom w:type="dxa" w:w="80"/>
+              <w:right w:type="dxa" w:w="110"/>
+            </w:tcMar>
+            <w:vAlign w:val="top"/>
+          </w:tcPr>
+          <w:p>
+            <w:pPr>
+              <w:spacing w:after="40" w:line="270"/>
+            </w:pPr>
+            <w:r>
+              <w:t xml:space="preserve">East of England</w:t>
+            </w:r>
+          </w:p>
+        </w:tc>
+        <w:tc>
+          <w:tcPr>
+            <w:tcW w:type="dxa" w:w="1927"/>
+            <w:tcBorders>
+              <w:top w:val="single" w:color="D9D2C3" w:sz="4"/>
+              <w:left w:val="single" w:color="D9D2C3" w:sz="4"/>
+              <w:bottom w:val="single" w:color="D9D2C3" w:sz="4"/>
+              <w:right w:val="single" w:color="D9D2C3" w:sz="4"/>
+            </w:tcBorders>
+            <w:tcMar>
+              <w:top w:type="dxa" w:w="80"/>
+              <w:left w:type="dxa" w:w="110"/>
+              <w:bottom w:type="dxa" w:w="80"/>
+              <w:right w:type="dxa" w:w="110"/>
+            </w:tcMar>
+            <w:vAlign w:val="top"/>
+          </w:tcPr>
+          <w:p>
+            <w:pPr>
+              <w:spacing w:after="40" w:line="270"/>
+            </w:pPr>
+            <w:r>
+              <w:t xml:space="preserve">3,554</w:t>
+            </w:r>
+          </w:p>
+        </w:tc>
+        <w:tc>
+          <w:tcPr>
+            <w:tcW w:type="dxa" w:w="2891"/>
+            <w:tcBorders>
+              <w:top w:val="single" w:color="D9D2C3" w:sz="4"/>
+              <w:left w:val="single" w:color="D9D2C3" w:sz="4"/>
+              <w:bottom w:val="single" w:color="D9D2C3" w:sz="4"/>
+              <w:right w:val="single" w:color="D9D2C3" w:sz="4"/>
+            </w:tcBorders>
+            <w:tcMar>
+              <w:top w:type="dxa" w:w="80"/>
+              <w:left w:type="dxa" w:w="110"/>
+              <w:bottom w:type="dxa" w:w="80"/>
+              <w:right w:type="dxa" w:w="110"/>
+            </w:tcMar>
+            <w:vAlign w:val="top"/>
+          </w:tcPr>
+          <w:p>
+            <w:pPr>
+              <w:spacing w:after="40" w:line="270"/>
+            </w:pPr>
+            <w:r>
+              <w:t xml:space="preserve">North East</w:t>
+            </w:r>
+          </w:p>
+        </w:tc>
+        <w:tc>
+          <w:tcPr>
+            <w:tcW w:type="dxa" w:w="1929"/>
+            <w:tcBorders>
+              <w:top w:val="single" w:color="D9D2C3" w:sz="4"/>
+              <w:left w:val="single" w:color="D9D2C3" w:sz="4"/>
+              <w:bottom w:val="single" w:color="D9D2C3" w:sz="4"/>
+              <w:right w:val="single" w:color="D9D2C3" w:sz="4"/>
+            </w:tcBorders>
+            <w:tcMar>
+              <w:top w:type="dxa" w:w="80"/>
+              <w:left w:type="dxa" w:w="110"/>
+              <w:bottom w:type="dxa" w:w="80"/>
+              <w:right w:type="dxa" w:w="110"/>
+            </w:tcMar>
+            <w:vAlign w:val="top"/>
+          </w:tcPr>
+          <w:p>
+            <w:pPr>
+              <w:spacing w:after="40" w:line="270"/>
+            </w:pPr>
+            <w:r>
+              <w:t xml:space="preserve">1,205</w:t>
+            </w:r>
+          </w:p>
+        </w:tc>
+      </w:tr>
+      <w:tr>
+        <w:trPr>
+          <w:cantSplit/>
+        </w:trPr>
+        <w:tc>
+          <w:tcPr>
+            <w:tcW w:type="dxa" w:w="2891"/>
+            <w:tcBorders>
+              <w:top w:val="single" w:color="D9D2C3" w:sz="4"/>
+              <w:left w:val="single" w:color="D9D2C3" w:sz="4"/>
+              <w:bottom w:val="single" w:color="D9D2C3" w:sz="4"/>
+              <w:right w:val="single" w:color="D9D2C3" w:sz="4"/>
+            </w:tcBorders>
+            <w:tcMar>
+              <w:top w:type="dxa" w:w="80"/>
+              <w:left w:type="dxa" w:w="110"/>
+              <w:bottom w:type="dxa" w:w="80"/>
+              <w:right w:type="dxa" w:w="110"/>
+            </w:tcMar>
+            <w:vAlign w:val="top"/>
+          </w:tcPr>
+          <w:p>
+            <w:pPr>
+              <w:spacing w:after="40" w:line="270"/>
+            </w:pPr>
+            <w:r>
+              <w:t xml:space="preserve">West Midlands</w:t>
+            </w:r>
+          </w:p>
+        </w:tc>
+        <w:tc>
+          <w:tcPr>
+            <w:tcW w:type="dxa" w:w="1927"/>
+            <w:tcBorders>
+              <w:top w:val="single" w:color="D9D2C3" w:sz="4"/>
+              <w:left w:val="single" w:color="D9D2C3" w:sz="4"/>
+              <w:bottom w:val="single" w:color="D9D2C3" w:sz="4"/>
+              <w:right w:val="single" w:color="D9D2C3" w:sz="4"/>
+            </w:tcBorders>
+            <w:tcMar>
+              <w:top w:type="dxa" w:w="80"/>
+              <w:left w:type="dxa" w:w="110"/>
+              <w:bottom w:type="dxa" w:w="80"/>
+              <w:right w:type="dxa" w:w="110"/>
+            </w:tcMar>
+            <w:vAlign w:val="top"/>
+          </w:tcPr>
+          <w:p>
+            <w:pPr>
+              <w:spacing w:after="40" w:line="270"/>
+            </w:pPr>
+            <w:r>
+              <w:t xml:space="preserve">3,437</w:t>
+            </w:r>
+          </w:p>
+        </w:tc>
+        <w:tc>
+          <w:tcPr>
+            <w:tcW w:type="dxa" w:w="2891"/>
+            <w:tcBorders>
+              <w:top w:val="single" w:color="D9D2C3" w:sz="4"/>
+              <w:left w:val="single" w:color="D9D2C3" w:sz="4"/>
+              <w:bottom w:val="single" w:color="D9D2C3" w:sz="4"/>
+              <w:right w:val="single" w:color="D9D2C3" w:sz="4"/>
+            </w:tcBorders>
+            <w:tcMar>
+              <w:top w:type="dxa" w:w="80"/>
+              <w:left w:type="dxa" w:w="110"/>
+              <w:bottom w:type="dxa" w:w="80"/>
+              <w:right w:type="dxa" w:w="110"/>
+            </w:tcMar>
+            <w:vAlign w:val="top"/>
+          </w:tcPr>
+          <w:p>
+            <w:pPr>
+              <w:spacing w:after="40" w:line="270"/>
+            </w:pPr>
+            <w:r>
+              <w:t xml:space="preserve">England total</w:t>
+            </w:r>
+          </w:p>
+        </w:tc>
+        <w:tc>
+          <w:tcPr>
+            <w:tcW w:type="dxa" w:w="1929"/>
+            <w:tcBorders>
+              <w:top w:val="single" w:color="D9D2C3" w:sz="4"/>
+              <w:left w:val="single" w:color="D9D2C3" w:sz="4"/>
+              <w:bottom w:val="single" w:color="D9D2C3" w:sz="4"/>
+              <w:right w:val="single" w:color="D9D2C3" w:sz="4"/>
+            </w:tcBorders>
+            <w:tcMar>
+              <w:top w:type="dxa" w:w="80"/>
+              <w:left w:type="dxa" w:w="110"/>
+              <w:bottom w:type="dxa" w:w="80"/>
+              <w:right w:type="dxa" w:w="110"/>
+            </w:tcMar>
+            <w:vAlign w:val="top"/>
+          </w:tcPr>
+          <w:p>
+            <w:pPr>
+              <w:spacing w:after="40" w:line="270"/>
+            </w:pPr>
+            <w:r>
+              <w:t xml:space="preserve">30,186</w:t>
+            </w:r>
+          </w:p>
+        </w:tc>
+      </w:tr>
+    </w:tbl>
+    <w:p>
+      <w:pPr>
+        <w:spacing w:after="120"/>
+      </w:pPr>
+    </w:p>
+    <w:p>
+      <w:pPr>
+        <w:spacing w:after="140" w:line="300"/>
+      </w:pPr>
+      <w:r>
+        <w:rPr>
+          <w:b/>
+          <w:bCs/>
+        </w:rPr>
+        <w:t xml:space="preserve">How we cover England as a small business:</w:t>
+      </w:r>
+      <w:r>
+        <w:t xml:space="preserve"> we focus first on roles where the client will pay for expertise and distance does not matter: Registered and Deputy Managers, nurses and clinical leads, and senior or hard-to-fill roles. Candidates for these roles relocate or travel, and interviews work well by video. Care assistant roles are filled by advertising in the client's own town.</w:t>
       </w:r>
     </w:p>
     <w:p>
@@ -3713,7 +4460,7 @@
               <w:spacing w:after="40" w:line="270"/>
             </w:pPr>
             <w:r>
-              <w:t xml:space="preserve">Not at the start</w:t>
+              <w:t xml:space="preserve">Not at the start (temporary supply only)</w:t>
             </w:r>
           </w:p>
         </w:tc>
@@ -3739,7 +4486,7 @@
               <w:spacing w:after="40" w:line="270"/>
             </w:pPr>
             <w:r>
-              <w:t xml:space="preserve">Registered Nurses, agency Clinical Leads, doctors and specialist clinicians, until compliance is audited and clinical advice is in place</w:t>
+              <w:t xml:space="preserve">Temporary Registered Nurses, agency Clinical Leads, doctors and specialist clinicians, until compliance is audited and clinical advice is in place. Permanent nurse and clinical lead recruitment is included from the start.</w:t>
             </w:r>
           </w:p>
         </w:tc>
@@ -3764,7 +4511,7 @@
         <w:spacing w:after="140" w:line="300"/>
       </w:pPr>
       <w:r>
-        <w:t xml:space="preserve">We compete with national care staffing agencies, local care recruitment agencies in Kent and South East London, general recruitment agencies, job boards, and providers hiring directly. </w:t>
+        <w:t xml:space="preserve">We compete with national care staffing agencies, regional care recruitment agencies, general recruitment agencies, job boards, and providers hiring directly. </w:t>
       </w:r>
       <w:r>
         <w:rPr>
@@ -5807,10 +6554,10 @@
           <w:b/>
           <w:bCs/>
         </w:rPr>
-        <w:t xml:space="preserve">Local networks:</w:t>
+        <w:t xml:space="preserve">Networks across England:</w:t>
       </w:r>
       <w:r>
-        <w:t xml:space="preserve"> registered manager networks, local authority provider forums, care associations in Kent and London.</w:t>
+        <w:t xml:space="preserve"> registered manager networks (Skills for Care), local authority provider forums and regional care associations in each region we target.</w:t>
       </w:r>
     </w:p>
     <w:p>

</xml_diff>